<commit_message>
Lab 1: six varieties, adding the fully-connected 2c and 3c
The simulation now has six varieties instead of four: three wiring patterns
(ipsilateral, contralateral, fully connected) x two signs (excitatory,
inhibitory). Fully-connected wiring is the general case - ipsilateral and
contralateral are the same wiring with half the connections missing - which
is what later modules build on when learning starts adjusting the weights.

- Six varieties (2a, 2b, 2c, 3a, 3b, 3c) throughout.
- Part 3 introduces the third wiring pattern and notes that ipsi/contra are
  really the fully-connected case with connections removed.
- New observation question (Part 2): do all six steer?
- New inference question (Part 3): the fully-connected vehicles cannot steer
  because both actuators always receive an identical signal. Students find
  them and compare the two actuator readouts to work out why.
- Report doc: matching questions and answer slots.

Co-Authored-By: Claude Opus 4.8 <noreply@anthropic.com>
</commit_message>
<xml_diff>
--- a/mind_and_brain/levels_of_analysis_lab/vehicles_lab_report.docx
+++ b/mind_and_brain/levels_of_analysis_lab/vehicles_lab_report.docx
@@ -170,7 +170,7 @@
           <w:sz w:val="20"/>
           <w:szCs w:val="20"/>
         </w:rPr>
-        <w:t>Write down your first impressions.  For now, don’t worry about being technical or precise.  Just describe the behaviors in everyday language. Don’t be afraid to use “mentalistic” language like curious, afraid, aggressive — that’s part of the exercise! How would you describe what each of the four varieties (2a, 2b, 3a, 3b) seems to be doing?</w:t>
+        <w:t>Write down your first impressions.  For now, don’t worry about being technical or precise.  Just describe the behaviors in everyday language. Don’t be afraid to use “mentalistic” language like curious, afraid, aggressive — that’s part of the exercise! How would you describe what each of the six varieties (2a, 2b, 2c, 3a, 3b, 3c) seems to be doing?</w:t>
       </w:r>
     </w:p>
     <w:p>
@@ -247,7 +247,7 @@
           <w:sz w:val="20"/>
           <w:szCs w:val="20"/>
         </w:rPr>
-        <w:t>What are the consistent differences you notice among the four varieties?</w:t>
+        <w:t>What are the consistent differences you notice among the six varieties?</w:t>
       </w:r>
     </w:p>
     <w:p>
@@ -477,7 +477,7 @@
           <w:sz w:val="20"/>
           <w:szCs w:val="20"/>
         </w:rPr>
-        <w:t>Which behaviors seem predictable, and which seem surprising?</w:t>
+        <w:t>Do all six varieties steer? Are there any that never seem to turn toward or away from anything, no matter where you put a heat source?</w:t>
       </w:r>
     </w:p>
     <w:p>
@@ -510,36 +510,10 @@
       <w:pPr>
         <w:rPr>
           <w:rFonts w:ascii="Calibri" w:hAnsi="Calibri" w:cs="Calibri"/>
-        </w:rPr>
-      </w:pPr>
-    </w:p>
-    <w:p>
-      <w:pPr>
-        <w:pBdr>
-          <w:bottom w:val="single" w:sz="12" w:space="1" w:color="auto"/>
-        </w:pBdr>
-        <w:rPr>
-          <w:rFonts w:ascii="Calibri" w:hAnsi="Calibri" w:cs="Calibri"/>
-          <w:b/>
-          <w:bCs/>
-        </w:rPr>
-      </w:pPr>
-      <w:r>
-        <w:rPr>
-          <w:rFonts w:ascii="Calibri" w:hAnsi="Calibri" w:cs="Calibri"/>
-          <w:b/>
-          <w:bCs/>
-        </w:rPr>
-        <w:t xml:space="preserve">Part </w:t>
-      </w:r>
-      <w:r>
-        <w:rPr>
-          <w:rFonts w:ascii="Calibri" w:hAnsi="Calibri" w:cs="Calibri"/>
-          <w:b/>
-          <w:bCs/>
-        </w:rPr>
-        <w:t>3</w:t>
-      </w:r>
+          <w:sz w:val="20"/>
+          <w:szCs w:val="20"/>
+        </w:rPr>
+      </w:pPr>
     </w:p>
     <w:p>
       <w:pPr>
@@ -560,7 +534,7 @@
           <w:sz w:val="20"/>
           <w:szCs w:val="20"/>
         </w:rPr>
-        <w:t>For each variety (2a, 2b, 3a, 3b), record whether its wiring is ipsilateral or contralateral, and whether its connections are excitatory or inhibitory.</w:t>
+        <w:t>Which behaviors seem predictable, and which seem surprising?</w:t>
       </w:r>
     </w:p>
     <w:p>
@@ -593,10 +567,36 @@
       <w:pPr>
         <w:rPr>
           <w:rFonts w:ascii="Calibri" w:hAnsi="Calibri" w:cs="Calibri"/>
-          <w:sz w:val="20"/>
-          <w:szCs w:val="20"/>
-        </w:rPr>
-      </w:pPr>
+        </w:rPr>
+      </w:pPr>
+    </w:p>
+    <w:p>
+      <w:pPr>
+        <w:pBdr>
+          <w:bottom w:val="single" w:sz="12" w:space="1" w:color="auto"/>
+        </w:pBdr>
+        <w:rPr>
+          <w:rFonts w:ascii="Calibri" w:hAnsi="Calibri" w:cs="Calibri"/>
+          <w:b/>
+          <w:bCs/>
+        </w:rPr>
+      </w:pPr>
+      <w:r>
+        <w:rPr>
+          <w:rFonts w:ascii="Calibri" w:hAnsi="Calibri" w:cs="Calibri"/>
+          <w:b/>
+          <w:bCs/>
+        </w:rPr>
+        <w:t xml:space="preserve">Part </w:t>
+      </w:r>
+      <w:r>
+        <w:rPr>
+          <w:rFonts w:ascii="Calibri" w:hAnsi="Calibri" w:cs="Calibri"/>
+          <w:b/>
+          <w:bCs/>
+        </w:rPr>
+        <w:t>3</w:t>
+      </w:r>
     </w:p>
     <w:p>
       <w:pPr>
@@ -617,7 +617,121 @@
           <w:sz w:val="20"/>
           <w:szCs w:val="20"/>
         </w:rPr>
+        <w:t>For each variety (2a, 2b, 2c, 3a, 3b, 3c), record whether its wiring is ipsilateral, contralateral, or fully connected, and whether its connections are excitatory or inhibitory.</w:t>
+      </w:r>
+    </w:p>
+    <w:p>
+      <w:pPr>
+        <w:rPr>
+          <w:rFonts w:ascii="Calibri" w:hAnsi="Calibri" w:cs="Calibri"/>
+          <w:sz w:val="20"/>
+          <w:szCs w:val="20"/>
+        </w:rPr>
+      </w:pPr>
+    </w:p>
+    <w:p>
+      <w:pPr>
+        <w:rPr>
+          <w:rFonts w:ascii="Calibri" w:hAnsi="Calibri" w:cs="Calibri"/>
+          <w:sz w:val="20"/>
+          <w:szCs w:val="20"/>
+        </w:rPr>
+      </w:pPr>
+      <w:r>
+        <w:rPr>
+          <w:rFonts w:ascii="Calibri" w:hAnsi="Calibri" w:cs="Calibri"/>
+          <w:sz w:val="20"/>
+          <w:szCs w:val="20"/>
+        </w:rPr>
+        <w:t>WRITE YOUR ANSWER HERE</w:t>
+      </w:r>
+    </w:p>
+    <w:p>
+      <w:pPr>
+        <w:rPr>
+          <w:rFonts w:ascii="Calibri" w:hAnsi="Calibri" w:cs="Calibri"/>
+          <w:sz w:val="20"/>
+          <w:szCs w:val="20"/>
+        </w:rPr>
+      </w:pPr>
+    </w:p>
+    <w:p>
+      <w:pPr>
+        <w:pStyle w:val="ListParagraph"/>
+        <w:numPr>
+          <w:ilvl w:val="0"/>
+          <w:numId w:val="2"/>
+        </w:numPr>
+        <w:rPr>
+          <w:rFonts w:ascii="Calibri" w:hAnsi="Calibri" w:cs="Calibri"/>
+          <w:sz w:val="20"/>
+          <w:szCs w:val="20"/>
+        </w:rPr>
+      </w:pPr>
+      <w:r>
+        <w:rPr>
+          <w:rFonts w:ascii="Calibri" w:hAnsi="Calibri" w:cs="Calibri"/>
+          <w:sz w:val="20"/>
+          <w:szCs w:val="20"/>
+        </w:rPr>
         <w:t>How does the wiring explain the way each variety moves around the heat sources?</w:t>
+      </w:r>
+    </w:p>
+    <w:p>
+      <w:pPr>
+        <w:rPr>
+          <w:rFonts w:ascii="Calibri" w:hAnsi="Calibri" w:cs="Calibri"/>
+          <w:sz w:val="20"/>
+          <w:szCs w:val="20"/>
+        </w:rPr>
+      </w:pPr>
+    </w:p>
+    <w:p>
+      <w:pPr>
+        <w:rPr>
+          <w:rFonts w:ascii="Calibri" w:hAnsi="Calibri" w:cs="Calibri"/>
+          <w:sz w:val="20"/>
+          <w:szCs w:val="20"/>
+        </w:rPr>
+      </w:pPr>
+      <w:r>
+        <w:rPr>
+          <w:rFonts w:ascii="Calibri" w:hAnsi="Calibri" w:cs="Calibri"/>
+          <w:sz w:val="20"/>
+          <w:szCs w:val="20"/>
+        </w:rPr>
+        <w:t>WRITE YOUR ANSWER HERE</w:t>
+      </w:r>
+    </w:p>
+    <w:p>
+      <w:pPr>
+        <w:rPr>
+          <w:rFonts w:ascii="Calibri" w:hAnsi="Calibri" w:cs="Calibri"/>
+          <w:sz w:val="20"/>
+          <w:szCs w:val="20"/>
+        </w:rPr>
+      </w:pPr>
+    </w:p>
+    <w:p>
+      <w:pPr>
+        <w:pStyle w:val="ListParagraph"/>
+        <w:numPr>
+          <w:ilvl w:val="0"/>
+          <w:numId w:val="2"/>
+        </w:numPr>
+        <w:rPr>
+          <w:rFonts w:ascii="Calibri" w:hAnsi="Calibri" w:cs="Calibri"/>
+          <w:sz w:val="20"/>
+          <w:szCs w:val="20"/>
+        </w:rPr>
+      </w:pPr>
+      <w:r>
+        <w:rPr>
+          <w:rFonts w:ascii="Calibri" w:hAnsi="Calibri" w:cs="Calibri"/>
+          <w:sz w:val="20"/>
+          <w:szCs w:val="20"/>
+        </w:rPr>
+        <w:t>Some varieties never steer at all, no matter where you put a heat source. Find them, and compare their two actuator values as they move. What is it about their wiring that makes turning impossible?</w:t>
       </w:r>
     </w:p>
     <w:p>

</xml_diff>

<commit_message>
Lab 1: say 'light' rather than 'heat' throughout
The handout was internally inconsistent - it told students to press the
'Clear lights' button while calling the stimuli heat sources everywhere else -
and the app has always said 'light'. Braitenberg's vehicles sense light, and
they render as little glowing orbs, so 'light' is both accurate and the more
intuitive read.

Handout and report doc both updated.

Co-Authored-By: Claude Opus 4.8 <noreply@anthropic.com>
</commit_message>
<xml_diff>
--- a/mind_and_brain/levels_of_analysis_lab/vehicles_lab_report.docx
+++ b/mind_and_brain/levels_of_analysis_lab/vehicles_lab_report.docx
@@ -306,7 +306,7 @@
           <w:sz w:val="20"/>
           <w:szCs w:val="20"/>
         </w:rPr>
-        <w:t>How does the distance to the heat source change each variety’s behavior?</w:t>
+        <w:t>How does the distance to the light source change each variety’s behavior?</w:t>
       </w:r>
     </w:p>
     <w:p>
@@ -420,7 +420,7 @@
           <w:sz w:val="20"/>
           <w:szCs w:val="20"/>
         </w:rPr>
-        <w:t>What happens when there are no heat sources at all? Which vehicles still move, and how?</w:t>
+        <w:t>What happens when there are no light sources at all? Which vehicles still move, and how?</w:t>
       </w:r>
     </w:p>
     <w:p>
@@ -477,7 +477,7 @@
           <w:sz w:val="20"/>
           <w:szCs w:val="20"/>
         </w:rPr>
-        <w:t>Do all six varieties steer? Are there any that never seem to turn toward or away from anything, no matter where you put a heat source?</w:t>
+        <w:t>Do all six varieties steer? Are there any that never seem to turn toward or away from anything, no matter where you put a light source?</w:t>
       </w:r>
     </w:p>
     <w:p>
@@ -674,7 +674,7 @@
           <w:sz w:val="20"/>
           <w:szCs w:val="20"/>
         </w:rPr>
-        <w:t>How does the wiring explain the way each variety moves around the heat sources?</w:t>
+        <w:t>How does the wiring explain the way each variety moves around the light sources?</w:t>
       </w:r>
     </w:p>
     <w:p>
@@ -731,7 +731,7 @@
           <w:sz w:val="20"/>
           <w:szCs w:val="20"/>
         </w:rPr>
-        <w:t>Some varieties never steer at all, no matter where you put a heat source. Find them, and compare their two actuator values as they move. What is it about their wiring that makes turning impossible?</w:t>
+        <w:t>Some varieties never steer at all, no matter where you put a light source. Find them, and compare their two actuator values as they move. What is it about their wiring that makes turning impossible?</w:t>
       </w:r>
     </w:p>
     <w:p>

</xml_diff>